<commit_message>
update new slides about the test result
</commit_message>
<xml_diff>
--- a/presentation/khung_noi_dung_slide.docx
+++ b/presentation/khung_noi_dung_slide.docx
@@ -323,7 +323,7 @@
       </w:r>
     </w:p>
     <w:bookmarkEnd w:id="9"/>
-    <w:bookmarkStart w:id="28" w:name="khung-slide"/>
+    <w:bookmarkStart w:id="31" w:name="khung-slide"/>
     <w:p>
       <w:pPr>
         <w:pStyle w:val="Heading1"/>
@@ -1299,7 +1299,7 @@
           <w:b/>
           <w:bCs/>
         </w:rPr>
-        <w:t xml:space="preserve">Hình cần chèn (chọn 2-3):</w:t>
+        <w:t xml:space="preserve">Hình cần chèn (ưu tiên cả 3):</w:t>
       </w:r>
     </w:p>
     <w:p>
@@ -1341,7 +1341,26 @@
         <w:t xml:space="preserve"> </w:t>
       </w:r>
       <w:r>
-        <w:t xml:space="preserve">— QQ plot.</w:t>
+        <w:t xml:space="preserve">— QQ plot (</w:t>
+      </w:r>
+      <w:r>
+        <w:rPr>
+          <w:b/>
+          <w:bCs/>
+        </w:rPr>
+        <w:t xml:space="preserve">nên chèn</w:t>
+      </w:r>
+      <w:r>
+        <w:t xml:space="preserve"> </w:t>
+      </w:r>
+      <w:r>
+        <w:t xml:space="preserve">— minh chứng trực quan</w:t>
+      </w:r>
+      <w:r>
+        <w:t xml:space="preserve"> </w:t>
+      </w:r>
+      <w:r>
+        <w:t xml:space="preserve">mạnh nhất cho heavy tails, điểm lệch ở hai đuôi dễ thấy hơn histogram).</w:t>
       </w:r>
     </w:p>
     <w:p>
@@ -3522,37 +3541,74 @@
         <w:pStyle w:val="BlockText"/>
       </w:pPr>
       <w:r>
-        <w:t xml:space="preserve">Khi dựng PowerPoint, đổi tiêu đề slide này thành</w:t>
-      </w:r>
-      <w:r>
-        <w:t xml:space="preserve"> </w:t>
-      </w:r>
-      <w:r>
-        <w:rPr>
-          <w:b/>
-          <w:bCs/>
-        </w:rPr>
-        <w:t xml:space="preserve">“Lý thuyết nền tảng của</w:t>
-      </w:r>
-      <w:r>
-        <w:rPr>
-          <w:b/>
-          <w:bCs/>
-        </w:rPr>
-        <w:t xml:space="preserve"> </w:t>
-      </w:r>
-      <w:r>
-        <w:rPr>
-          <w:b/>
-          <w:bCs/>
-        </w:rPr>
-        <w:t xml:space="preserve">GARCH(1,1)”</w:t>
-      </w:r>
-      <w:r>
-        <w:t xml:space="preserve"> </w:t>
-      </w:r>
-      <w:r>
-        <w:t xml:space="preserve">và bỏ toàn bộ năm bullet đã xuất hiện ở slide trước.</w:t>
+        <w:rPr>
+          <w:b/>
+          <w:bCs/>
+        </w:rPr>
+        <w:t xml:space="preserve">⚠️ LỖI TRÊN PPT HIỆN TẠI (bao_cao_demo.pdf):</w:t>
+      </w:r>
+      <w:r>
+        <w:t xml:space="preserve"> </w:t>
+      </w:r>
+      <w:r>
+        <w:t xml:space="preserve">Slide 11 đang copy nguyên năm</w:t>
+      </w:r>
+      <w:r>
+        <w:t xml:space="preserve"> </w:t>
+      </w:r>
+      <w:r>
+        <w:t xml:space="preserve">bullet của Slide 10 (</w:t>
+      </w:r>
+      <w:r>
+        <w:t xml:space="preserve">“Forecast giá trả lời…”</w:t>
+      </w:r>
+      <w:r>
+        <w:t xml:space="preserve">,</w:t>
+      </w:r>
+      <w:r>
+        <w:t xml:space="preserve"> </w:t>
+      </w:r>
+      <w:r>
+        <w:t xml:space="preserve">“Log return…”</w:t>
+      </w:r>
+      <w:r>
+        <w:t xml:space="preserve">, v.v.).</w:t>
+      </w:r>
+      <w:r>
+        <w:t xml:space="preserve"> </w:t>
+      </w:r>
+      <w:r>
+        <w:rPr>
+          <w:b/>
+          <w:bCs/>
+        </w:rPr>
+        <w:t xml:space="preserve">Phải</w:t>
+      </w:r>
+      <w:r>
+        <w:rPr>
+          <w:b/>
+          <w:bCs/>
+        </w:rPr>
+        <w:t xml:space="preserve"> </w:t>
+      </w:r>
+      <w:r>
+        <w:rPr>
+          <w:b/>
+          <w:bCs/>
+        </w:rPr>
+        <w:t xml:space="preserve">xóa hết năm bullet đó</w:t>
+      </w:r>
+      <w:r>
+        <w:t xml:space="preserve"> </w:t>
+      </w:r>
+      <w:r>
+        <w:t xml:space="preserve">và chỉ giữ lại: công thức GARCH, bảng ký hiệu và đoạn</w:t>
+      </w:r>
+      <w:r>
+        <w:t xml:space="preserve"> </w:t>
+      </w:r>
+      <w:r>
+        <w:t xml:space="preserve">giải thích ở trên. Nội dung Slide 10 và Slide 11 phải khác nhau hoàn toàn.</w:t>
       </w:r>
     </w:p>
     <w:p>
@@ -4837,7 +4893,7 @@
         </w:numPr>
       </w:pPr>
       <w:r>
-        <w:t xml:space="preserve">Core residual diagnostics đạt + Nyblom stability đạt.</w:t>
+        <w:t xml:space="preserve">Core residual diagnostics (LB + ARCH-LM + Sign-bias) đạt ở cả 4 model.</w:t>
       </w:r>
     </w:p>
     <w:p>
@@ -4849,7 +4905,29 @@
         </w:numPr>
       </w:pPr>
       <w:r>
-        <w:t xml:space="preserve">Tuy nhiên Pearson GOF bác bỏ distribution fit → đây là hạn chế.</w:t>
+        <w:rPr>
+          <w:b/>
+          <w:bCs/>
+        </w:rPr>
+        <w:t xml:space="preserve">Nyblom stability chỉ eGARCH đạt</w:t>
+      </w:r>
+      <w:r>
+        <w:t xml:space="preserve"> </w:t>
+      </w:r>
+      <w:r>
+        <w:t xml:space="preserve">— ba model còn lại đều vượt ngưỡng.</w:t>
+      </w:r>
+    </w:p>
+    <w:p>
+      <w:pPr>
+        <w:pStyle w:val="Compact"/>
+        <w:numPr>
+          <w:ilvl w:val="0"/>
+          <w:numId w:val="1019"/>
+        </w:numPr>
+      </w:pPr>
+      <w:r>
+        <w:t xml:space="preserve">Pearson GOF bác bỏ distribution fit ở cả 4 → đây là hạn chế chung.</w:t>
       </w:r>
     </w:p>
     <w:p>
@@ -4899,6 +4977,793 @@
           <w:b/>
           <w:bCs/>
         </w:rPr>
+        <w:t xml:space="preserve">Lời thoại gợi ý (~30 giây):</w:t>
+      </w:r>
+    </w:p>
+    <w:p>
+      <w:pPr>
+        <w:pStyle w:val="BlockText"/>
+      </w:pPr>
+      <w:r>
+        <w:t xml:space="preserve">Trong 4 model, GJR có AIC nhỏ nhất nhưng Nyblom lại bác bỏ tính ổn định tham số.</w:t>
+      </w:r>
+      <w:r>
+        <w:t xml:space="preserve"> </w:t>
+      </w:r>
+      <w:r>
+        <w:t xml:space="preserve">eGARCH có AIC bám rất sát GJR, trong khi toàn bộ core diagnostics và Nyblom đều đạt.</w:t>
+      </w:r>
+      <w:r>
+        <w:t xml:space="preserve"> </w:t>
+      </w:r>
+      <w:r>
+        <w:t xml:space="preserve">Vì vậy nhóm chọn eGARCH-t là ứng viên cân bằng nhất, chứ không tuyên bố đây là</w:t>
+      </w:r>
+      <w:r>
+        <w:t xml:space="preserve"> </w:t>
+      </w:r>
+      <w:r>
+        <w:t xml:space="preserve">model hoàn hảo tuyệt đối vì Pearson GOF vẫn bị bác bỏ.</w:t>
+      </w:r>
+    </w:p>
+    <w:p>
+      <w:pPr>
+        <w:pStyle w:val="FirstParagraph"/>
+      </w:pPr>
+      <w:r>
+        <w:rPr>
+          <w:b/>
+          <w:bCs/>
+        </w:rPr>
+        <w:t xml:space="preserve">Người nói:</w:t>
+      </w:r>
+      <w:r>
+        <w:t xml:space="preserve"> </w:t>
+      </w:r>
+      <w:r>
+        <w:t xml:space="preserve">Lê Đặng Hoàng Anh.</w:t>
+      </w:r>
+    </w:p>
+    <w:bookmarkEnd w:id="23"/>
+    <w:bookmarkStart w:id="24" w:name="X33cf6694e4600364106a03b76617693291b776a"/>
+    <w:p>
+      <w:pPr>
+        <w:pStyle w:val="Heading2"/>
+      </w:pPr>
+      <w:r>
+        <w:rPr>
+          <w:rStyle w:val="SectionNumber"/>
+        </w:rPr>
+        <w:t xml:space="preserve">2.15</w:t>
+      </w:r>
+      <w:r>
+        <w:tab/>
+      </w:r>
+      <w:r>
+        <w:t xml:space="preserve">Slide 15 — Kết quả kiểm định (Bảng p-value chi tiết)</w:t>
+      </w:r>
+    </w:p>
+    <w:p>
+      <w:pPr>
+        <w:pStyle w:val="FirstParagraph"/>
+      </w:pPr>
+      <w:r>
+        <w:rPr>
+          <w:b/>
+          <w:bCs/>
+        </w:rPr>
+        <w:t xml:space="preserve">Nội dung trên slide:</w:t>
+      </w:r>
+      <w:r>
+        <w:t xml:space="preserve"> </w:t>
+      </w:r>
+      <w:r>
+        <w:t xml:space="preserve">(Bảng 6x6 như hình đã cung cấp)</w:t>
+      </w:r>
+    </w:p>
+    <w:tbl>
+      <w:tblPr>
+        <w:tblStyle w:val="Table"/>
+        <w:tblW w:type="pct" w:w="5000"/>
+        <w:tblLayout w:type="fixed"/>
+        <w:tblLook w:firstRow="1" w:lastRow="0" w:firstColumn="0" w:lastColumn="0" w:noHBand="0" w:noVBand="0" w:val="0020"/>
+      </w:tblPr>
+      <w:tblGrid>
+        <w:gridCol w:w="990"/>
+        <w:gridCol w:w="1320"/>
+        <w:gridCol w:w="1320"/>
+        <w:gridCol w:w="1320"/>
+        <w:gridCol w:w="1320"/>
+        <w:gridCol w:w="1650"/>
+      </w:tblGrid>
+      <w:tr>
+        <w:trPr>
+          <w:tblHeader w:val="on"/>
+        </w:trPr>
+        <w:tc>
+          <w:tcPr/>
+          <w:p>
+            <w:pPr>
+              <w:pStyle w:val="Compact"/>
+            </w:pPr>
+            <w:r>
+              <w:t xml:space="preserve">Diagnostic</w:t>
+            </w:r>
+          </w:p>
+        </w:tc>
+        <w:tc>
+          <w:tcPr/>
+          <w:p>
+            <w:pPr>
+              <w:pStyle w:val="Compact"/>
+              <w:jc w:val="right"/>
+            </w:pPr>
+            <w:r>
+              <w:t xml:space="preserve">sGARCH-N</w:t>
+            </w:r>
+          </w:p>
+        </w:tc>
+        <w:tc>
+          <w:tcPr/>
+          <w:p>
+            <w:pPr>
+              <w:pStyle w:val="Compact"/>
+              <w:jc w:val="right"/>
+            </w:pPr>
+            <w:r>
+              <w:t xml:space="preserve">sGARCH-t</w:t>
+            </w:r>
+          </w:p>
+        </w:tc>
+        <w:tc>
+          <w:tcPr/>
+          <w:p>
+            <w:pPr>
+              <w:pStyle w:val="Compact"/>
+              <w:jc w:val="right"/>
+            </w:pPr>
+            <w:r>
+              <w:t xml:space="preserve">eGARCH-t</w:t>
+            </w:r>
+          </w:p>
+        </w:tc>
+        <w:tc>
+          <w:tcPr/>
+          <w:p>
+            <w:pPr>
+              <w:pStyle w:val="Compact"/>
+              <w:jc w:val="right"/>
+            </w:pPr>
+            <w:r>
+              <w:t xml:space="preserve">GJR-t</w:t>
+            </w:r>
+          </w:p>
+        </w:tc>
+        <w:tc>
+          <w:tcPr/>
+          <w:p>
+            <w:pPr>
+              <w:pStyle w:val="Compact"/>
+              <w:jc w:val="center"/>
+            </w:pPr>
+            <w:r>
+              <w:t xml:space="preserve">Kết quả</w:t>
+            </w:r>
+          </w:p>
+        </w:tc>
+      </w:tr>
+      <w:tr>
+        <w:tc>
+          <w:tcPr/>
+          <w:p>
+            <w:pPr>
+              <w:pStyle w:val="Compact"/>
+            </w:pPr>
+            <w:r>
+              <w:t xml:space="preserve">LB residual</w:t>
+            </w:r>
+          </w:p>
+        </w:tc>
+        <w:tc>
+          <w:tcPr/>
+          <w:p>
+            <w:pPr>
+              <w:pStyle w:val="Compact"/>
+              <w:jc w:val="right"/>
+            </w:pPr>
+            <w:r>
+              <w:t xml:space="preserve">0,817</w:t>
+            </w:r>
+          </w:p>
+        </w:tc>
+        <w:tc>
+          <w:tcPr/>
+          <w:p>
+            <w:pPr>
+              <w:pStyle w:val="Compact"/>
+              <w:jc w:val="right"/>
+            </w:pPr>
+            <w:r>
+              <w:t xml:space="preserve">0,859</w:t>
+            </w:r>
+          </w:p>
+        </w:tc>
+        <w:tc>
+          <w:tcPr/>
+          <w:p>
+            <w:pPr>
+              <w:pStyle w:val="Compact"/>
+              <w:jc w:val="right"/>
+            </w:pPr>
+            <w:r>
+              <w:t xml:space="preserve">0,877</w:t>
+            </w:r>
+          </w:p>
+        </w:tc>
+        <w:tc>
+          <w:tcPr/>
+          <w:p>
+            <w:pPr>
+              <w:pStyle w:val="Compact"/>
+              <w:jc w:val="right"/>
+            </w:pPr>
+            <w:r>
+              <w:t xml:space="preserve">0,868</w:t>
+            </w:r>
+          </w:p>
+        </w:tc>
+        <w:tc>
+          <w:tcPr/>
+          <w:p>
+            <w:pPr>
+              <w:pStyle w:val="Compact"/>
+              <w:jc w:val="center"/>
+            </w:pPr>
+            <w:r>
+              <w:t xml:space="preserve">✅ Cả 4</w:t>
+            </w:r>
+          </w:p>
+        </w:tc>
+      </w:tr>
+      <w:tr>
+        <w:tc>
+          <w:tcPr/>
+          <w:p>
+            <w:pPr>
+              <w:pStyle w:val="Compact"/>
+            </w:pPr>
+            <w:r>
+              <w:t xml:space="preserve">LB squared</w:t>
+            </w:r>
+          </w:p>
+        </w:tc>
+        <w:tc>
+          <w:tcPr/>
+          <w:p>
+            <w:pPr>
+              <w:pStyle w:val="Compact"/>
+              <w:jc w:val="right"/>
+            </w:pPr>
+            <w:r>
+              <w:t xml:space="preserve">0,881</w:t>
+            </w:r>
+          </w:p>
+        </w:tc>
+        <w:tc>
+          <w:tcPr/>
+          <w:p>
+            <w:pPr>
+              <w:pStyle w:val="Compact"/>
+              <w:jc w:val="right"/>
+            </w:pPr>
+            <w:r>
+              <w:t xml:space="preserve">0,783</w:t>
+            </w:r>
+          </w:p>
+        </w:tc>
+        <w:tc>
+          <w:tcPr/>
+          <w:p>
+            <w:pPr>
+              <w:pStyle w:val="Compact"/>
+              <w:jc w:val="right"/>
+            </w:pPr>
+            <w:r>
+              <w:t xml:space="preserve">0,842</w:t>
+            </w:r>
+          </w:p>
+        </w:tc>
+        <w:tc>
+          <w:tcPr/>
+          <w:p>
+            <w:pPr>
+              <w:pStyle w:val="Compact"/>
+              <w:jc w:val="right"/>
+            </w:pPr>
+            <w:r>
+              <w:t xml:space="preserve">0,632</w:t>
+            </w:r>
+          </w:p>
+        </w:tc>
+        <w:tc>
+          <w:tcPr/>
+          <w:p>
+            <w:pPr>
+              <w:pStyle w:val="Compact"/>
+              <w:jc w:val="center"/>
+            </w:pPr>
+            <w:r>
+              <w:t xml:space="preserve">✅ Cả 4</w:t>
+            </w:r>
+          </w:p>
+        </w:tc>
+      </w:tr>
+      <w:tr>
+        <w:tc>
+          <w:tcPr/>
+          <w:p>
+            <w:pPr>
+              <w:pStyle w:val="Compact"/>
+            </w:pPr>
+            <w:r>
+              <w:t xml:space="preserve">ARCH-LM</w:t>
+            </w:r>
+          </w:p>
+        </w:tc>
+        <w:tc>
+          <w:tcPr/>
+          <w:p>
+            <w:pPr>
+              <w:pStyle w:val="Compact"/>
+              <w:jc w:val="right"/>
+            </w:pPr>
+            <w:r>
+              <w:t xml:space="preserve">0,810</w:t>
+            </w:r>
+          </w:p>
+        </w:tc>
+        <w:tc>
+          <w:tcPr/>
+          <w:p>
+            <w:pPr>
+              <w:pStyle w:val="Compact"/>
+              <w:jc w:val="right"/>
+            </w:pPr>
+            <w:r>
+              <w:t xml:space="preserve">0,494</w:t>
+            </w:r>
+          </w:p>
+        </w:tc>
+        <w:tc>
+          <w:tcPr/>
+          <w:p>
+            <w:pPr>
+              <w:pStyle w:val="Compact"/>
+              <w:jc w:val="right"/>
+            </w:pPr>
+            <w:r>
+              <w:t xml:space="preserve">0,646</w:t>
+            </w:r>
+          </w:p>
+        </w:tc>
+        <w:tc>
+          <w:tcPr/>
+          <w:p>
+            <w:pPr>
+              <w:pStyle w:val="Compact"/>
+              <w:jc w:val="right"/>
+            </w:pPr>
+            <w:r>
+              <w:t xml:space="preserve">0,366</w:t>
+            </w:r>
+          </w:p>
+        </w:tc>
+        <w:tc>
+          <w:tcPr/>
+          <w:p>
+            <w:pPr>
+              <w:pStyle w:val="Compact"/>
+              <w:jc w:val="center"/>
+            </w:pPr>
+            <w:r>
+              <w:t xml:space="preserve">✅ Cả 4</w:t>
+            </w:r>
+          </w:p>
+        </w:tc>
+      </w:tr>
+      <w:tr>
+        <w:tc>
+          <w:tcPr/>
+          <w:p>
+            <w:pPr>
+              <w:pStyle w:val="Compact"/>
+            </w:pPr>
+            <w:r>
+              <w:t xml:space="preserve">Sign-bias joint</w:t>
+            </w:r>
+          </w:p>
+        </w:tc>
+        <w:tc>
+          <w:tcPr/>
+          <w:p>
+            <w:pPr>
+              <w:pStyle w:val="Compact"/>
+              <w:jc w:val="right"/>
+            </w:pPr>
+            <w:r>
+              <w:t xml:space="preserve">0,103</w:t>
+            </w:r>
+          </w:p>
+        </w:tc>
+        <w:tc>
+          <w:tcPr/>
+          <w:p>
+            <w:pPr>
+              <w:pStyle w:val="Compact"/>
+              <w:jc w:val="right"/>
+            </w:pPr>
+            <w:r>
+              <w:t xml:space="preserve">0,060</w:t>
+            </w:r>
+          </w:p>
+        </w:tc>
+        <w:tc>
+          <w:tcPr/>
+          <w:p>
+            <w:pPr>
+              <w:pStyle w:val="Compact"/>
+              <w:jc w:val="right"/>
+            </w:pPr>
+            <w:r>
+              <w:t xml:space="preserve">0,102</w:t>
+            </w:r>
+          </w:p>
+        </w:tc>
+        <w:tc>
+          <w:tcPr/>
+          <w:p>
+            <w:pPr>
+              <w:pStyle w:val="Compact"/>
+              <w:jc w:val="right"/>
+            </w:pPr>
+            <w:r>
+              <w:t xml:space="preserve">0,086</w:t>
+            </w:r>
+          </w:p>
+        </w:tc>
+        <w:tc>
+          <w:tcPr/>
+          <w:p>
+            <w:pPr>
+              <w:pStyle w:val="Compact"/>
+              <w:jc w:val="center"/>
+            </w:pPr>
+            <w:r>
+              <w:t xml:space="preserve">✅ Cả 4</w:t>
+            </w:r>
+          </w:p>
+        </w:tc>
+      </w:tr>
+      <w:tr>
+        <w:tc>
+          <w:tcPr/>
+          <w:p>
+            <w:pPr>
+              <w:pStyle w:val="Compact"/>
+            </w:pPr>
+            <w:r>
+              <w:t xml:space="preserve">Nyblom (stat/crit)</w:t>
+            </w:r>
+          </w:p>
+        </w:tc>
+        <w:tc>
+          <w:tcPr/>
+          <w:p>
+            <w:pPr>
+              <w:pStyle w:val="Compact"/>
+              <w:jc w:val="right"/>
+            </w:pPr>
+            <w:r>
+              <w:t xml:space="preserve">12,90/1,24</w:t>
+            </w:r>
+          </w:p>
+        </w:tc>
+        <w:tc>
+          <w:tcPr/>
+          <w:p>
+            <w:pPr>
+              <w:pStyle w:val="Compact"/>
+              <w:jc w:val="right"/>
+            </w:pPr>
+            <w:r>
+              <w:t xml:space="preserve">11,89/1,47</w:t>
+            </w:r>
+          </w:p>
+        </w:tc>
+        <w:tc>
+          <w:tcPr/>
+          <w:p>
+            <w:pPr>
+              <w:pStyle w:val="Compact"/>
+              <w:jc w:val="right"/>
+            </w:pPr>
+            <w:r>
+              <w:t xml:space="preserve">1,50/1,68</w:t>
+            </w:r>
+          </w:p>
+        </w:tc>
+        <w:tc>
+          <w:tcPr/>
+          <w:p>
+            <w:pPr>
+              <w:pStyle w:val="Compact"/>
+              <w:jc w:val="right"/>
+            </w:pPr>
+            <w:r>
+              <w:t xml:space="preserve">27,35/1,68</w:t>
+            </w:r>
+          </w:p>
+        </w:tc>
+        <w:tc>
+          <w:tcPr/>
+          <w:p>
+            <w:pPr>
+              <w:pStyle w:val="Compact"/>
+              <w:jc w:val="center"/>
+            </w:pPr>
+            <w:r>
+              <w:t xml:space="preserve">✅ eGARCH</w:t>
+            </w:r>
+          </w:p>
+        </w:tc>
+      </w:tr>
+      <w:tr>
+        <w:tc>
+          <w:tcPr/>
+          <w:p>
+            <w:pPr>
+              <w:pStyle w:val="Compact"/>
+            </w:pPr>
+            <w:r>
+              <w:t xml:space="preserve">Pearson GOF</w:t>
+            </w:r>
+          </w:p>
+        </w:tc>
+        <w:tc>
+          <w:tcPr/>
+          <w:p>
+            <w:pPr>
+              <w:pStyle w:val="Compact"/>
+              <w:jc w:val="right"/>
+            </w:pPr>
+            <w:r>
+              <w:t xml:space="preserve">≈ 0</w:t>
+            </w:r>
+          </w:p>
+        </w:tc>
+        <w:tc>
+          <w:tcPr/>
+          <w:p>
+            <w:pPr>
+              <w:pStyle w:val="Compact"/>
+              <w:jc w:val="right"/>
+            </w:pPr>
+            <w:r>
+              <w:t xml:space="preserve">1,4 × 10⁻¹¹</w:t>
+            </w:r>
+          </w:p>
+        </w:tc>
+        <w:tc>
+          <w:tcPr/>
+          <w:p>
+            <w:pPr>
+              <w:pStyle w:val="Compact"/>
+              <w:jc w:val="right"/>
+            </w:pPr>
+            <w:r>
+              <w:t xml:space="preserve">2,0 × 10⁻¹⁵</w:t>
+            </w:r>
+          </w:p>
+        </w:tc>
+        <w:tc>
+          <w:tcPr/>
+          <w:p>
+            <w:pPr>
+              <w:pStyle w:val="Compact"/>
+              <w:jc w:val="right"/>
+            </w:pPr>
+            <w:r>
+              <w:t xml:space="preserve">5,4 × 10⁻¹⁴</w:t>
+            </w:r>
+          </w:p>
+        </w:tc>
+        <w:tc>
+          <w:tcPr/>
+          <w:p>
+            <w:pPr>
+              <w:pStyle w:val="Compact"/>
+              <w:jc w:val="center"/>
+            </w:pPr>
+            <w:r>
+              <w:t xml:space="preserve">❌ Cả 4</w:t>
+            </w:r>
+          </w:p>
+        </w:tc>
+      </w:tr>
+    </w:tbl>
+    <w:p>
+      <w:pPr>
+        <w:pStyle w:val="BodyText"/>
+      </w:pPr>
+      <w:r>
+        <w:rPr>
+          <w:b/>
+          <w:bCs/>
+        </w:rPr>
+        <w:t xml:space="preserve">Đoạn có thể đặt trực tiếp trên slide để nhìn và đọc:</w:t>
+      </w:r>
+    </w:p>
+    <w:p>
+      <w:pPr>
+        <w:pStyle w:val="BlockText"/>
+      </w:pPr>
+      <w:r>
+        <w:t xml:space="preserve">P-value ≥ 0,05 (chưa bác bỏ H₀) được xem là đạt đối với 4 kiểm định đầu tiên.</w:t>
+      </w:r>
+      <w:r>
+        <w:t xml:space="preserve"> </w:t>
+      </w:r>
+      <w:r>
+        <w:t xml:space="preserve">Riêng kiểm định Nyblom so sánh test statistic với critical value. Cả 4 mô hình</w:t>
+      </w:r>
+      <w:r>
+        <w:t xml:space="preserve"> </w:t>
+      </w:r>
+      <w:r>
+        <w:t xml:space="preserve">đều giải quyết được các hiệu ứng phương sai, nhưng chỉ eGARCH là có tham số</w:t>
+      </w:r>
+      <w:r>
+        <w:t xml:space="preserve"> </w:t>
+      </w:r>
+      <w:r>
+        <w:t xml:space="preserve">ổn định qua thời gian.</w:t>
+      </w:r>
+    </w:p>
+    <w:p>
+      <w:pPr>
+        <w:pStyle w:val="FirstParagraph"/>
+      </w:pPr>
+      <w:r>
+        <w:rPr>
+          <w:b/>
+          <w:bCs/>
+        </w:rPr>
+        <w:t xml:space="preserve">Lời thoại gợi ý (~40 giây):</w:t>
+      </w:r>
+    </w:p>
+    <w:p>
+      <w:pPr>
+        <w:pStyle w:val="BlockText"/>
+      </w:pPr>
+      <w:r>
+        <w:t xml:space="preserve">Đây là bảng p-value chi tiết minh chứng cho quyết định ở slide trước. Với 4</w:t>
+      </w:r>
+      <w:r>
+        <w:t xml:space="preserve"> </w:t>
+      </w:r>
+      <w:r>
+        <w:t xml:space="preserve">kiểm định đầu, quy tắc là p-value lớn hơn 0,05 thì đạt. Các con số ở đây đều</w:t>
+      </w:r>
+      <w:r>
+        <w:t xml:space="preserve"> </w:t>
+      </w:r>
+      <w:r>
+        <w:t xml:space="preserve">lớn hơn 0,05, xác nhận cả 4 model đều không còn bỏ sót cấu trúc trung bình,</w:t>
+      </w:r>
+      <w:r>
+        <w:t xml:space="preserve"> </w:t>
+      </w:r>
+      <w:r>
+        <w:t xml:space="preserve">cấu trúc phương sai và phản ứng bất đối xứng.</w:t>
+      </w:r>
+      <w:r>
+        <w:t xml:space="preserve"> </w:t>
+      </w:r>
+      <w:r>
+        <w:t xml:space="preserve">Tuy nhiên, với Nyblom, statistic của eGARCH là 1,50 nhỏ hơn ngưỡng 1,68 nên</w:t>
+      </w:r>
+      <w:r>
+        <w:t xml:space="preserve"> </w:t>
+      </w:r>
+      <w:r>
+        <w:t xml:space="preserve">đạt tính ổn định, trong khi 3 model kia vi phạm rất xa. Cuối cùng, Pearson GOF</w:t>
+      </w:r>
+      <w:r>
+        <w:t xml:space="preserve"> </w:t>
+      </w:r>
+      <w:r>
+        <w:t xml:space="preserve">đều xấp xỉ 0, bác bỏ phân phối Student-t ở toàn bộ mô hình.</w:t>
+      </w:r>
+    </w:p>
+    <w:p>
+      <w:pPr>
+        <w:pStyle w:val="FirstParagraph"/>
+      </w:pPr>
+      <w:r>
+        <w:rPr>
+          <w:b/>
+          <w:bCs/>
+        </w:rPr>
+        <w:t xml:space="preserve">Người nói:</w:t>
+      </w:r>
+      <w:r>
+        <w:t xml:space="preserve"> </w:t>
+      </w:r>
+      <w:r>
+        <w:t xml:space="preserve">Lê Đặng Hoàng Anh.</w:t>
+      </w:r>
+    </w:p>
+    <w:bookmarkEnd w:id="24"/>
+    <w:bookmarkStart w:id="25" w:name="X95b69edcccb6777068a31318a7d5c3d86dc5a5a"/>
+    <w:p>
+      <w:pPr>
+        <w:pStyle w:val="Heading2"/>
+      </w:pPr>
+      <w:r>
+        <w:rPr>
+          <w:rStyle w:val="SectionNumber"/>
+        </w:rPr>
+        <w:t xml:space="preserve">2.16</w:t>
+      </w:r>
+      <w:r>
+        <w:tab/>
+      </w:r>
+      <w:r>
+        <w:t xml:space="preserve">Slide 16 — Conditional volatility theo thời gian</w:t>
+      </w:r>
+    </w:p>
+    <w:p>
+      <w:pPr>
+        <w:pStyle w:val="BlockText"/>
+      </w:pPr>
+      <w:r>
+        <w:rPr>
+          <w:b/>
+          <w:bCs/>
+        </w:rPr>
+        <w:t xml:space="preserve">Ghi chú:</w:t>
+      </w:r>
+      <w:r>
+        <w:t xml:space="preserve"> </w:t>
+      </w:r>
+      <w:r>
+        <w:t xml:space="preserve">PPT thực tế (</w:t>
+      </w:r>
+      <w:r>
+        <w:rPr>
+          <w:rStyle w:val="VerbatimChar"/>
+        </w:rPr>
+        <w:t xml:space="preserve">bao_cao_demo.pdf</w:t>
+      </w:r>
+      <w:r>
+        <w:t xml:space="preserve">) tách biểu đồ volatility thành</w:t>
+      </w:r>
+      <w:r>
+        <w:t xml:space="preserve"> </w:t>
+      </w:r>
+      <w:r>
+        <w:t xml:space="preserve">slide riêng (Slide 15). Rmd cũ gộp vào Slide 14 nên thiếu slide này.</w:t>
+      </w:r>
+    </w:p>
+    <w:p>
+      <w:pPr>
+        <w:pStyle w:val="FirstParagraph"/>
+      </w:pPr>
+      <w:r>
+        <w:rPr>
+          <w:b/>
+          <w:bCs/>
+        </w:rPr>
         <w:t xml:space="preserve">Hình:</w:t>
       </w:r>
       <w:r>
@@ -4923,6 +5788,39 @@
           <w:b/>
           <w:bCs/>
         </w:rPr>
+        <w:t xml:space="preserve">Hình bổ sung (khuyến nghị):</w:t>
+      </w:r>
+      <w:r>
+        <w:t xml:space="preserve"> </w:t>
+      </w:r>
+      <w:r>
+        <w:rPr>
+          <w:rStyle w:val="VerbatimChar"/>
+        </w:rPr>
+        <w:t xml:space="preserve">output/figures/garch_acf_diagnostics.png</w:t>
+      </w:r>
+      <w:r>
+        <w:t xml:space="preserve"> </w:t>
+      </w:r>
+      <w:r>
+        <w:t xml:space="preserve">— ACF</w:t>
+      </w:r>
+      <w:r>
+        <w:t xml:space="preserve"> </w:t>
+      </w:r>
+      <w:r>
+        <w:t xml:space="preserve">standardized residual và squared residual, minh chứng core diagnostics đạt.</w:t>
+      </w:r>
+    </w:p>
+    <w:p>
+      <w:pPr>
+        <w:pStyle w:val="BodyText"/>
+      </w:pPr>
+      <w:r>
+        <w:rPr>
+          <w:b/>
+          <w:bCs/>
+        </w:rPr>
         <w:t xml:space="preserve">Câu kết luận phải đặt dưới biểu đồ volatility:</w:t>
       </w:r>
     </w:p>
@@ -4955,7 +5853,7 @@
           <w:b/>
           <w:bCs/>
         </w:rPr>
-        <w:t xml:space="preserve">Lời thoại gợi ý (~55 giây):</w:t>
+        <w:t xml:space="preserve">Lời thoại gợi ý (~15 giây):</w:t>
       </w:r>
     </w:p>
     <w:p>
@@ -4963,25 +5861,19 @@
         <w:pStyle w:val="BlockText"/>
       </w:pPr>
       <w:r>
-        <w:t xml:space="preserve">GJR có AIC nhỏ nhất, nhưng Nyblom bác bỏ tính ổn định tham số. eGARCH chỉ kém</w:t>
-      </w:r>
-      <w:r>
-        <w:t xml:space="preserve"> </w:t>
-      </w:r>
-      <w:r>
-        <w:t xml:space="preserve">GJR khoảng 0,00137 AIC, trong khi các core diagnostics và Nyblom đều đạt. Vì</w:t>
-      </w:r>
-      <w:r>
-        <w:t xml:space="preserve"> </w:t>
-      </w:r>
-      <w:r>
-        <w:t xml:space="preserve">vậy nhóm chọn eGARCH-t là ứng viên cân bằng, chứ không tuyên bố đây là model tốt</w:t>
-      </w:r>
-      <w:r>
-        <w:t xml:space="preserve"> </w:t>
-      </w:r>
-      <w:r>
-        <w:t xml:space="preserve">tuyệt đối. Pearson GOF vẫn bị bác bỏ nên distribution còn chưa mô tả hết dữ liệu.</w:t>
+        <w:t xml:space="preserve">Nhìn vào biểu đồ, bốn mô hình phát hiện cùng các giai đoạn volatility cao nhưng</w:t>
+      </w:r>
+      <w:r>
+        <w:t xml:space="preserve"> </w:t>
+      </w:r>
+      <w:r>
+        <w:t xml:space="preserve">khác nhau về độ nhạy tại các đỉnh. ACF cho thấy residual và squared residual đều</w:t>
+      </w:r>
+      <w:r>
+        <w:t xml:space="preserve"> </w:t>
+      </w:r>
+      <w:r>
+        <w:t xml:space="preserve">nằm trong ngưỡng, xác nhận model đã nắm bắt được dynamics chính.</w:t>
       </w:r>
     </w:p>
     <w:p>
@@ -5002,8 +5894,8 @@
         <w:t xml:space="preserve">Lê Đặng Hoàng Anh.</w:t>
       </w:r>
     </w:p>
-    <w:bookmarkEnd w:id="23"/>
-    <w:bookmarkStart w:id="24" w:name="slide-15-phần-việc-người-3-đã-thực-hiện"/>
+    <w:bookmarkEnd w:id="25"/>
+    <w:bookmarkStart w:id="26" w:name="slide-17-phần-việc-người-3-đã-thực-hiện"/>
     <w:p>
       <w:pPr>
         <w:pStyle w:val="Heading2"/>
@@ -5012,13 +5904,13 @@
         <w:rPr>
           <w:rStyle w:val="SectionNumber"/>
         </w:rPr>
-        <w:t xml:space="preserve">2.15</w:t>
+        <w:t xml:space="preserve">2.17</w:t>
       </w:r>
       <w:r>
         <w:tab/>
       </w:r>
       <w:r>
-        <w:t xml:space="preserve">Slide 15 — Phần việc Người 3 đã thực hiện</w:t>
+        <w:t xml:space="preserve">Slide 17 — Phần việc Người 3 đã thực hiện</w:t>
       </w:r>
     </w:p>
     <w:p>
@@ -5283,8 +6175,8 @@
         <w:t xml:space="preserve">Lê Đặng Hoàng Anh.</w:t>
       </w:r>
     </w:p>
-    <w:bookmarkEnd w:id="24"/>
-    <w:bookmarkStart w:id="25" w:name="slide-16-hạn-chế-và-hướng-phát-triển"/>
+    <w:bookmarkEnd w:id="26"/>
+    <w:bookmarkStart w:id="27" w:name="slide-18-hạn-chế-và-hướng-phát-triển"/>
     <w:p>
       <w:pPr>
         <w:pStyle w:val="Heading2"/>
@@ -5293,13 +6185,13 @@
         <w:rPr>
           <w:rStyle w:val="SectionNumber"/>
         </w:rPr>
-        <w:t xml:space="preserve">2.16</w:t>
+        <w:t xml:space="preserve">2.18</w:t>
       </w:r>
       <w:r>
         <w:tab/>
       </w:r>
       <w:r>
-        <w:t xml:space="preserve">Slide 16 — Hạn chế và hướng phát triển</w:t>
+        <w:t xml:space="preserve">Slide 18 — Hạn chế và hướng phát triển</w:t>
       </w:r>
     </w:p>
     <w:p>
@@ -5446,8 +6338,8 @@
         <w:t xml:space="preserve">Lê Đặng Hoàng Anh.</w:t>
       </w:r>
     </w:p>
-    <w:bookmarkEnd w:id="25"/>
-    <w:bookmarkStart w:id="26" w:name="slide-17-kết-luận"/>
+    <w:bookmarkEnd w:id="27"/>
+    <w:bookmarkStart w:id="28" w:name="slide-19-kết-luận"/>
     <w:p>
       <w:pPr>
         <w:pStyle w:val="Heading2"/>
@@ -5456,13 +6348,13 @@
         <w:rPr>
           <w:rStyle w:val="SectionNumber"/>
         </w:rPr>
-        <w:t xml:space="preserve">2.17</w:t>
+        <w:t xml:space="preserve">2.19</w:t>
       </w:r>
       <w:r>
         <w:tab/>
       </w:r>
       <w:r>
-        <w:t xml:space="preserve">Slide 17 — Kết luận</w:t>
+        <w:t xml:space="preserve">Slide 19 — Kết luận</w:t>
       </w:r>
     </w:p>
     <w:p>
@@ -5605,8 +6497,8 @@
         <w:t xml:space="preserve">Lê Đặng Hoàng Anh.</w:t>
       </w:r>
     </w:p>
-    <w:bookmarkEnd w:id="26"/>
-    <w:bookmarkStart w:id="27" w:name="Xd6482e33125d97c29ce5bf292809537d6f315f1"/>
+    <w:bookmarkEnd w:id="28"/>
+    <w:bookmarkStart w:id="29" w:name="Xa6c9bd78ac83c0bf8262b507f74974706331e7c"/>
     <w:p>
       <w:pPr>
         <w:pStyle w:val="Heading2"/>
@@ -5615,13 +6507,13 @@
         <w:rPr>
           <w:rStyle w:val="SectionNumber"/>
         </w:rPr>
-        <w:t xml:space="preserve">2.18</w:t>
+        <w:t xml:space="preserve">2.20</w:t>
       </w:r>
       <w:r>
         <w:tab/>
       </w:r>
       <w:r>
-        <w:t xml:space="preserve">Slide 18 — Bảng phân công công việc</w:t>
+        <w:t xml:space="preserve">Slide 20 — Bảng phân công công việc</w:t>
       </w:r>
       <w:r>
         <w:t xml:space="preserve"> </w:t>
@@ -5672,6 +6564,62 @@
       </w:r>
       <w:r>
         <w:t xml:space="preserve">rubric. Đồng thời chiếu trên slide khi kết thúc phần trình bày.</w:t>
+      </w:r>
+    </w:p>
+    <w:p>
+      <w:pPr>
+        <w:pStyle w:val="BlockText"/>
+      </w:pPr>
+      <w:r>
+        <w:rPr>
+          <w:b/>
+          <w:bCs/>
+        </w:rPr>
+        <w:t xml:space="preserve">⚠️ LỖI TRÊN PPT HIỆN TẠI:</w:t>
+      </w:r>
+      <w:r>
+        <w:t xml:space="preserve"> </w:t>
+      </w:r>
+      <w:r>
+        <w:t xml:space="preserve">Bảng phân công có 6 cột nhưng cột cuối cùng lặp</w:t>
+      </w:r>
+      <w:r>
+        <w:t xml:space="preserve"> </w:t>
+      </w:r>
+      <w:r>
+        <w:t xml:space="preserve">lại y hệt cột đầu (Tên + MSSV). Phải sửa cột cuối thành</w:t>
+      </w:r>
+      <w:r>
+        <w:t xml:space="preserve"> </w:t>
+      </w:r>
+      <w:r>
+        <w:rPr>
+          <w:b/>
+          <w:bCs/>
+        </w:rPr>
+        <w:t xml:space="preserve">“Mức độ hoàn thành”</w:t>
+      </w:r>
+      <w:r>
+        <w:t xml:space="preserve"> </w:t>
+      </w:r>
+      <w:r>
+        <w:t xml:space="preserve">hoặc</w:t>
+      </w:r>
+      <w:r>
+        <w:t xml:space="preserve"> </w:t>
+      </w:r>
+      <w:r>
+        <w:rPr>
+          <w:b/>
+          <w:bCs/>
+        </w:rPr>
+        <w:t xml:space="preserve">“Ký tên”</w:t>
+      </w:r>
+      <w:r>
+        <w:t xml:space="preserve"> </w:t>
+      </w:r>
+      <w:r>
+        <w:t xml:space="preserve">(nếu bản in cần chữ ký). Không để cột trùng.</w:t>
       </w:r>
     </w:p>
     <w:tbl>
@@ -5804,36 +6752,18 @@
               <w:pStyle w:val="Compact"/>
             </w:pPr>
             <w:r>
-              <w:t xml:space="preserve">Thu thập dữ liệu Yahoo Finance, làm sạch (</w:t>
-            </w:r>
-            <w:r>
-              <w:rPr>
-                <w:rStyle w:val="VerbatimChar"/>
-              </w:rPr>
-              <w:t xml:space="preserve">01_data_cleaning.R</w:t>
-            </w:r>
-            <w:r>
-              <w:t xml:space="preserve">), kiểm tra chất lượng, trực quan hóa EDA (</w:t>
-            </w:r>
-            <w:r>
-              <w:rPr>
-                <w:rStyle w:val="VerbatimChar"/>
-              </w:rPr>
-              <w:t xml:space="preserve">02_visualization.R</w:t>
-            </w:r>
-            <w:r>
-              <w:t xml:space="preserve">) — 9 biểu đồ</w:t>
-            </w:r>
-          </w:p>
-        </w:tc>
-        <w:tc>
-          <w:tcPr/>
-          <w:p>
-            <w:pPr>
-              <w:pStyle w:val="Compact"/>
-            </w:pPr>
-            <w:r>
-              <w:t xml:space="preserve">15/06 – 19/06/2026</w:t>
+              <w:t xml:space="preserve">Nguồn dữ liệu, cleaning, quality checks và EDA</w:t>
+            </w:r>
+          </w:p>
+        </w:tc>
+        <w:tc>
+          <w:tcPr/>
+          <w:p>
+            <w:pPr>
+              <w:pStyle w:val="Compact"/>
+            </w:pPr>
+            <w:r>
+              <w:t xml:space="preserve">25/05 – 19/06/2026</w:t>
             </w:r>
           </w:p>
         </w:tc>
@@ -5892,27 +6822,18 @@
               <w:pStyle w:val="Compact"/>
             </w:pPr>
             <w:r>
-              <w:t xml:space="preserve">Kiểm định ADF, dự báo giá: Naive, Drift, ARIMA, SARIMA, ETS, ETS Damped, ARIMAX (</w:t>
-            </w:r>
-            <w:r>
-              <w:rPr>
-                <w:rStyle w:val="VerbatimChar"/>
-              </w:rPr>
-              <w:t xml:space="preserve">03_stationarity_arima_ets.R</w:t>
-            </w:r>
-            <w:r>
-              <w:t xml:space="preserve">), rolling-origin CV, residual diagnostics</w:t>
-            </w:r>
-          </w:p>
-        </w:tc>
-        <w:tc>
-          <w:tcPr/>
-          <w:p>
-            <w:pPr>
-              <w:pStyle w:val="Compact"/>
-            </w:pPr>
-            <w:r>
-              <w:t xml:space="preserve">15/06 – 19/06/2026</w:t>
+              <w:t xml:space="preserve">ADF, forecast framework, benchmark, rolling CV và diagnostics</w:t>
+            </w:r>
+          </w:p>
+        </w:tc>
+        <w:tc>
+          <w:tcPr/>
+          <w:p>
+            <w:pPr>
+              <w:pStyle w:val="Compact"/>
+            </w:pPr>
+            <w:r>
+              <w:t xml:space="preserve">25/05 – 19/06/2026</w:t>
             </w:r>
           </w:p>
         </w:tc>
@@ -5971,45 +6892,18 @@
               <w:pStyle w:val="Compact"/>
             </w:pPr>
             <w:r>
-              <w:t xml:space="preserve">GARCH 4 specification (</w:t>
-            </w:r>
-            <w:r>
-              <w:rPr>
-                <w:rStyle w:val="VerbatimChar"/>
-              </w:rPr>
-              <w:t xml:space="preserve">04_garch_volatility.R</w:t>
-            </w:r>
-            <w:r>
-              <w:t xml:space="preserve">), model comparison (</w:t>
-            </w:r>
-            <w:r>
-              <w:rPr>
-                <w:rStyle w:val="VerbatimChar"/>
-              </w:rPr>
-              <w:t xml:space="preserve">05_model_comparison.R</w:t>
-            </w:r>
-            <w:r>
-              <w:t xml:space="preserve">), export tables (</w:t>
-            </w:r>
-            <w:r>
-              <w:rPr>
-                <w:rStyle w:val="VerbatimChar"/>
-              </w:rPr>
-              <w:t xml:space="preserve">06_export_report_tables.R</w:t>
-            </w:r>
-            <w:r>
-              <w:t xml:space="preserve">), tích hợp báo cáo Word, khung slide</w:t>
-            </w:r>
-          </w:p>
-        </w:tc>
-        <w:tc>
-          <w:tcPr/>
-          <w:p>
-            <w:pPr>
-              <w:pStyle w:val="Compact"/>
-            </w:pPr>
-            <w:r>
-              <w:t xml:space="preserve">15/06 – 20/06/2026</w:t>
+              <w:t xml:space="preserve">GARCH variants, diagnostics, comparison và tích hợp báo cáo</w:t>
+            </w:r>
+          </w:p>
+        </w:tc>
+        <w:tc>
+          <w:tcPr/>
+          <w:p>
+            <w:pPr>
+              <w:pStyle w:val="Compact"/>
+            </w:pPr>
+            <w:r>
+              <w:t xml:space="preserve">25/05 – 19/06/2026</w:t>
             </w:r>
           </w:p>
         </w:tc>
@@ -6051,17 +6945,134 @@
         <w:t xml:space="preserve">và review chéo PR.</w:t>
       </w:r>
     </w:p>
-    <w:p>
-      <w:pPr>
-        <w:pStyle w:val="BodyText"/>
-      </w:pPr>
-      <w:r>
-        <w:t xml:space="preserve">Cảm ơn giảng viên TS. Phan Thị Thể. Mời đặt câu hỏi.</w:t>
-      </w:r>
-    </w:p>
-    <w:bookmarkEnd w:id="27"/>
-    <w:bookmarkEnd w:id="28"/>
-    <w:bookmarkStart w:id="29" w:name="câu-hỏi-phản-biện-cần-chuẩn-bị"/>
+    <w:bookmarkEnd w:id="29"/>
+    <w:bookmarkStart w:id="30" w:name="slide-21-cảm-ơn"/>
+    <w:p>
+      <w:pPr>
+        <w:pStyle w:val="Heading2"/>
+      </w:pPr>
+      <w:r>
+        <w:rPr>
+          <w:rStyle w:val="SectionNumber"/>
+        </w:rPr>
+        <w:t xml:space="preserve">2.21</w:t>
+      </w:r>
+      <w:r>
+        <w:tab/>
+      </w:r>
+      <w:r>
+        <w:t xml:space="preserve">Slide 21 — Cảm ơn</w:t>
+      </w:r>
+    </w:p>
+    <w:p>
+      <w:pPr>
+        <w:pStyle w:val="BlockText"/>
+      </w:pPr>
+      <w:r>
+        <w:rPr>
+          <w:b/>
+          <w:bCs/>
+        </w:rPr>
+        <w:t xml:space="preserve">Ghi chú:</w:t>
+      </w:r>
+      <w:r>
+        <w:t xml:space="preserve"> </w:t>
+      </w:r>
+      <w:r>
+        <w:t xml:space="preserve">PPT hiện có slide</w:t>
+      </w:r>
+      <w:r>
+        <w:t xml:space="preserve"> </w:t>
+      </w:r>
+      <w:r>
+        <w:t xml:space="preserve">“Thanks For Listening”</w:t>
+      </w:r>
+      <w:r>
+        <w:t xml:space="preserve"> </w:t>
+      </w:r>
+      <w:r>
+        <w:t xml:space="preserve">(Slide 19 trong PDF) nhưng</w:t>
+      </w:r>
+      <w:r>
+        <w:t xml:space="preserve"> </w:t>
+      </w:r>
+      <w:r>
+        <w:t xml:space="preserve">Rmd cũ không mô tả. Nên đổi sang tiếng Việt cho nhất quán.</w:t>
+      </w:r>
+    </w:p>
+    <w:p>
+      <w:pPr>
+        <w:pStyle w:val="FirstParagraph"/>
+      </w:pPr>
+      <w:r>
+        <w:rPr>
+          <w:b/>
+          <w:bCs/>
+        </w:rPr>
+        <w:t xml:space="preserve">Nội dung trên slide:</w:t>
+      </w:r>
+    </w:p>
+    <w:p>
+      <w:pPr>
+        <w:pStyle w:val="Compact"/>
+        <w:numPr>
+          <w:ilvl w:val="0"/>
+          <w:numId w:val="1023"/>
+        </w:numPr>
+      </w:pPr>
+      <w:r>
+        <w:t xml:space="preserve">Tiêu đề:</w:t>
+      </w:r>
+      <w:r>
+        <w:t xml:space="preserve"> </w:t>
+      </w:r>
+      <w:r>
+        <w:rPr>
+          <w:b/>
+          <w:bCs/>
+        </w:rPr>
+        <w:t xml:space="preserve">Cảm ơn thầy/cô đã lắng nghe!</w:t>
+      </w:r>
+    </w:p>
+    <w:p>
+      <w:pPr>
+        <w:pStyle w:val="Compact"/>
+        <w:numPr>
+          <w:ilvl w:val="0"/>
+          <w:numId w:val="1023"/>
+        </w:numPr>
+      </w:pPr>
+      <w:r>
+        <w:t xml:space="preserve">Dòng phụ: Mời thầy/cô đặt câu hỏi.</w:t>
+      </w:r>
+    </w:p>
+    <w:p>
+      <w:pPr>
+        <w:pStyle w:val="FirstParagraph"/>
+      </w:pPr>
+      <w:r>
+        <w:rPr>
+          <w:b/>
+          <w:bCs/>
+        </w:rPr>
+        <w:t xml:space="preserve">Người nói:</w:t>
+      </w:r>
+      <w:r>
+        <w:t xml:space="preserve"> </w:t>
+      </w:r>
+      <w:r>
+        <w:t xml:space="preserve">Lê Đặng Hoàng Anh —</w:t>
+      </w:r>
+      <w:r>
+        <w:t xml:space="preserve"> </w:t>
+      </w:r>
+      <w:r>
+        <w:t xml:space="preserve">“Cảm ơn cô đã lắng nghe. Nhóm sẵn sàng trả lời câu hỏi ạ.”</w:t>
+      </w:r>
+    </w:p>
+    <w:bookmarkEnd w:id="30"/>
+    <w:bookmarkEnd w:id="31"/>
+    <w:bookmarkStart w:id="32" w:name="câu-hỏi-phản-biện-cần-chuẩn-bị"/>
     <w:p>
       <w:pPr>
         <w:pStyle w:val="Heading1"/>
@@ -6084,7 +7095,7 @@
         <w:pStyle w:val="Compact"/>
         <w:numPr>
           <w:ilvl w:val="0"/>
-          <w:numId w:val="1023"/>
+          <w:numId w:val="1024"/>
         </w:numPr>
       </w:pPr>
       <w:r>
@@ -6096,7 +7107,7 @@
         <w:pStyle w:val="Compact"/>
         <w:numPr>
           <w:ilvl w:val="0"/>
-          <w:numId w:val="1023"/>
+          <w:numId w:val="1024"/>
         </w:numPr>
       </w:pPr>
       <w:r>
@@ -6108,7 +7119,7 @@
         <w:pStyle w:val="Compact"/>
         <w:numPr>
           <w:ilvl w:val="0"/>
-          <w:numId w:val="1023"/>
+          <w:numId w:val="1024"/>
         </w:numPr>
       </w:pPr>
       <w:r>
@@ -6120,7 +7131,7 @@
         <w:pStyle w:val="Compact"/>
         <w:numPr>
           <w:ilvl w:val="0"/>
-          <w:numId w:val="1023"/>
+          <w:numId w:val="1024"/>
         </w:numPr>
       </w:pPr>
       <w:r>
@@ -6132,7 +7143,7 @@
         <w:pStyle w:val="Compact"/>
         <w:numPr>
           <w:ilvl w:val="0"/>
-          <w:numId w:val="1023"/>
+          <w:numId w:val="1024"/>
         </w:numPr>
       </w:pPr>
       <w:r>
@@ -6144,7 +7155,7 @@
         <w:pStyle w:val="Compact"/>
         <w:numPr>
           <w:ilvl w:val="0"/>
-          <w:numId w:val="1023"/>
+          <w:numId w:val="1024"/>
         </w:numPr>
       </w:pPr>
       <w:r>
@@ -6156,7 +7167,7 @@
         <w:pStyle w:val="Compact"/>
         <w:numPr>
           <w:ilvl w:val="0"/>
-          <w:numId w:val="1023"/>
+          <w:numId w:val="1024"/>
         </w:numPr>
       </w:pPr>
       <w:r>
@@ -6177,15 +7188,15 @@
         <w:pStyle w:val="Compact"/>
         <w:numPr>
           <w:ilvl w:val="0"/>
-          <w:numId w:val="1023"/>
+          <w:numId w:val="1024"/>
         </w:numPr>
       </w:pPr>
       <w:r>
         <w:t xml:space="preserve">Vì sao kết quả không thể xem là khuyến nghị đầu tư?</w:t>
       </w:r>
     </w:p>
-    <w:bookmarkEnd w:id="29"/>
-    <w:bookmarkStart w:id="32" w:name="checklist-trước-khi-xuất-powerpoint"/>
+    <w:bookmarkEnd w:id="32"/>
+    <w:bookmarkStart w:id="35" w:name="checklist-trước-khi-xuất-powerpoint"/>
     <w:p>
       <w:pPr>
         <w:pStyle w:val="Heading1"/>
@@ -6203,7 +7214,7 @@
         <w:t xml:space="preserve">Checklist trước khi xuất PowerPoint</w:t>
       </w:r>
     </w:p>
-    <w:bookmarkStart w:id="30" w:name="yêu-cầu-rubric"/>
+    <w:bookmarkStart w:id="33" w:name="yêu-cầu-rubric"/>
     <w:p>
       <w:pPr>
         <w:pStyle w:val="Heading2"/>
@@ -6226,7 +7237,7 @@
         <w:pStyle w:val="Compact"/>
         <w:numPr>
           <w:ilvl w:val="0"/>
-          <w:numId w:val="1024"/>
+          <w:numId w:val="1025"/>
         </w:numPr>
       </w:pPr>
       <w:r>
@@ -6238,7 +7249,7 @@
         <w:pStyle w:val="Compact"/>
         <w:numPr>
           <w:ilvl w:val="0"/>
-          <w:numId w:val="1025"/>
+          <w:numId w:val="1026"/>
         </w:numPr>
       </w:pPr>
       <w:r>
@@ -6263,7 +7274,7 @@
         <w:pStyle w:val="Compact"/>
         <w:numPr>
           <w:ilvl w:val="0"/>
-          <w:numId w:val="1026"/>
+          <w:numId w:val="1027"/>
         </w:numPr>
       </w:pPr>
       <w:r>
@@ -6275,7 +7286,7 @@
         <w:pStyle w:val="Compact"/>
         <w:numPr>
           <w:ilvl w:val="0"/>
-          <w:numId w:val="1027"/>
+          <w:numId w:val="1028"/>
         </w:numPr>
       </w:pPr>
       <w:r>
@@ -6287,7 +7298,7 @@
         <w:pStyle w:val="Compact"/>
         <w:numPr>
           <w:ilvl w:val="0"/>
-          <w:numId w:val="1028"/>
+          <w:numId w:val="1029"/>
         </w:numPr>
       </w:pPr>
       <w:r>
@@ -6299,7 +7310,7 @@
         <w:pStyle w:val="Compact"/>
         <w:numPr>
           <w:ilvl w:val="0"/>
-          <w:numId w:val="1029"/>
+          <w:numId w:val="1030"/>
         </w:numPr>
       </w:pPr>
       <w:r>
@@ -6311,15 +7322,55 @@
         <w:pStyle w:val="Compact"/>
         <w:numPr>
           <w:ilvl w:val="0"/>
-          <w:numId w:val="1030"/>
-        </w:numPr>
-      </w:pPr>
-      <w:r>
-        <w:t xml:space="preserve">Có đánh giá hiệu suất mô hình (Slide 9, 13-14).</w:t>
-      </w:r>
-    </w:p>
-    <w:bookmarkEnd w:id="30"/>
-    <w:bookmarkStart w:id="31" w:name="kiểm-tra-kỹ-thuật"/>
+          <w:numId w:val="1031"/>
+        </w:numPr>
+      </w:pPr>
+      <w:r>
+        <w:t xml:space="preserve">Có đánh giá hiệu suất mô hình (Slide 9, 13-16).</w:t>
+      </w:r>
+    </w:p>
+    <w:p>
+      <w:pPr>
+        <w:pStyle w:val="Compact"/>
+        <w:numPr>
+          <w:ilvl w:val="0"/>
+          <w:numId w:val="1032"/>
+        </w:numPr>
+      </w:pPr>
+      <w:r>
+        <w:t xml:space="preserve">Slide 11</w:t>
+      </w:r>
+      <w:r>
+        <w:t xml:space="preserve"> </w:t>
+      </w:r>
+      <w:r>
+        <w:rPr>
+          <w:b/>
+          <w:bCs/>
+        </w:rPr>
+        <w:t xml:space="preserve">không</w:t>
+      </w:r>
+      <w:r>
+        <w:t xml:space="preserve"> </w:t>
+      </w:r>
+      <w:r>
+        <w:t xml:space="preserve">trùng bullet với Slide 10.</w:t>
+      </w:r>
+    </w:p>
+    <w:p>
+      <w:pPr>
+        <w:pStyle w:val="Compact"/>
+        <w:numPr>
+          <w:ilvl w:val="0"/>
+          <w:numId w:val="1033"/>
+        </w:numPr>
+      </w:pPr>
+      <w:r>
+        <w:t xml:space="preserve">Bảng phân công (Slide 20) không có cột trùng lặp.</w:t>
+      </w:r>
+    </w:p>
+    <w:bookmarkEnd w:id="33"/>
+    <w:bookmarkStart w:id="34" w:name="kiểm-tra-kỹ-thuật"/>
     <w:p>
       <w:pPr>
         <w:pStyle w:val="Heading2"/>
@@ -6342,7 +7393,7 @@
         <w:pStyle w:val="Compact"/>
         <w:numPr>
           <w:ilvl w:val="0"/>
-          <w:numId w:val="1031"/>
+          <w:numId w:val="1034"/>
         </w:numPr>
       </w:pPr>
       <w:r>
@@ -6354,7 +7405,7 @@
         <w:pStyle w:val="Compact"/>
         <w:numPr>
           <w:ilvl w:val="0"/>
-          <w:numId w:val="1032"/>
+          <w:numId w:val="1035"/>
         </w:numPr>
       </w:pPr>
       <w:r>
@@ -6366,7 +7417,7 @@
         <w:pStyle w:val="Compact"/>
         <w:numPr>
           <w:ilvl w:val="0"/>
-          <w:numId w:val="1033"/>
+          <w:numId w:val="1036"/>
         </w:numPr>
       </w:pPr>
       <w:r>
@@ -6378,7 +7429,7 @@
         <w:pStyle w:val="Compact"/>
         <w:numPr>
           <w:ilvl w:val="0"/>
-          <w:numId w:val="1034"/>
+          <w:numId w:val="1037"/>
         </w:numPr>
       </w:pPr>
       <w:r>
@@ -6390,15 +7441,15 @@
         <w:pStyle w:val="Compact"/>
         <w:numPr>
           <w:ilvl w:val="0"/>
-          <w:numId w:val="1035"/>
+          <w:numId w:val="1038"/>
         </w:numPr>
       </w:pPr>
       <w:r>
         <w:t xml:space="preserve">Giữ tổng thời lượng trong 10-12 phút.</w:t>
       </w:r>
     </w:p>
-    <w:bookmarkEnd w:id="31"/>
-    <w:bookmarkEnd w:id="32"/>
+    <w:bookmarkEnd w:id="34"/>
+    <w:bookmarkEnd w:id="35"/>
     <w:sectPr>
       <w:footnotePr>
         <w:numRestart w:val="eachSect"/>
@@ -6897,6 +7948,9 @@
     </w:lvlOverride>
   </w:num>
   <w:num w:numId="1023">
+    <w:abstractNumId w:val="991"/>
+  </w:num>
+  <w:num w:numId="1024">
     <w:abstractNumId w:val="99411"/>
     <w:lvlOverride w:ilvl="0">
       <w:startOverride w:val="1"/>
@@ -6925,9 +7979,6 @@
     <w:lvlOverride w:ilvl="8">
       <w:startOverride w:val="1"/>
     </w:lvlOverride>
-  </w:num>
-  <w:num w:numId="1024">
-    <w:abstractNumId w:val="992"/>
   </w:num>
   <w:num w:numId="1025">
     <w:abstractNumId w:val="992"/>
@@ -6960,6 +8011,15 @@
     <w:abstractNumId w:val="992"/>
   </w:num>
   <w:num w:numId="1035">
+    <w:abstractNumId w:val="992"/>
+  </w:num>
+  <w:num w:numId="1036">
+    <w:abstractNumId w:val="992"/>
+  </w:num>
+  <w:num w:numId="1037">
+    <w:abstractNumId w:val="992"/>
+  </w:num>
+  <w:num w:numId="1038">
     <w:abstractNumId w:val="992"/>
   </w:num>
 </w:numbering>

</xml_diff>